<commit_message>
feat: VA1 questiosn done
</commit_message>
<xml_diff>
--- a/51VA Veb analityka/1/VA1_KNT-116m_Onyshchenko_15.docx
+++ b/51VA Veb analityka/1/VA1_KNT-116m_Onyshchenko_15.docx
@@ -320,30 +320,7 @@
         <w:tab/>
         <w:tab/>
         <w:tab/>
-      </w:r>
-      <w:r>
-        <w:rPr/>
-        <w:t>Зайко</w:t>
-      </w:r>
-      <w:r>
-        <w:rPr/>
-        <w:t xml:space="preserve"> </w:t>
-      </w:r>
-      <w:r>
-        <w:rPr/>
-        <w:t>Т</w:t>
-      </w:r>
-      <w:r>
-        <w:rPr/>
-        <w:t>.</w:t>
-      </w:r>
-      <w:r>
-        <w:rPr/>
-        <w:t>А</w:t>
-      </w:r>
-      <w:r>
-        <w:rPr/>
-        <w:t>.</w:t>
+        <w:t>Зайко Т.А.</w:t>
       </w:r>
     </w:p>
     <w:p>
@@ -598,6 +575,664 @@
       <w:r>
         <w:rPr/>
         <w:t>визначати джерела даних і вимоги до їх отримання для подальшого аналітичного дослідження.</w:t>
+      </w:r>
+    </w:p>
+    <w:p>
+      <w:pPr>
+        <w:pStyle w:val="p11"/>
+        <w:widowControl/>
+        <w:suppressAutoHyphens w:val="true"/>
+        <w:bidi w:val="0"/>
+        <w:spacing w:lineRule="auto" w:line="360" w:before="0" w:after="0"/>
+        <w:ind w:firstLine="850" w:left="0" w:right="0"/>
+        <w:jc w:val="left"/>
+        <w:rPr/>
+      </w:pPr>
+      <w:r>
+        <w:rPr/>
+      </w:r>
+    </w:p>
+    <w:p>
+      <w:pPr>
+        <w:pStyle w:val="h11"/>
+        <w:rPr/>
+      </w:pPr>
+      <w:r>
+        <w:rPr/>
+        <w:t>Питання</w:t>
+      </w:r>
+    </w:p>
+    <w:p>
+      <w:pPr>
+        <w:pStyle w:val="H2"/>
+        <w:rPr/>
+      </w:pPr>
+      <w:r>
+        <w:rPr/>
+        <w:t xml:space="preserve">1 Які завдання вирішуються під час первинного аналітичного дослідження вебсайту? </w:t>
+      </w:r>
+    </w:p>
+    <w:p>
+      <w:pPr>
+        <w:pStyle w:val="P1"/>
+        <w:rPr/>
+      </w:pPr>
+      <w:r>
+        <w:rPr/>
+      </w:r>
+    </w:p>
+    <w:p>
+      <w:pPr>
+        <w:pStyle w:val="P1"/>
+        <w:rPr/>
+      </w:pPr>
+      <w:r>
+        <w:rPr/>
+        <w:t>Оцінка його структури, контенту, а</w:t>
+      </w:r>
+      <w:r>
+        <w:rPr/>
+        <w:t>в</w:t>
+      </w:r>
+      <w:r>
+        <w:rPr/>
+        <w:t xml:space="preserve">диторії, конкурентів та пошукової видимості. </w:t>
+      </w:r>
+    </w:p>
+    <w:p>
+      <w:pPr>
+        <w:pStyle w:val="P1"/>
+        <w:rPr/>
+      </w:pPr>
+      <w:r>
+        <w:rPr/>
+      </w:r>
+    </w:p>
+    <w:p>
+      <w:pPr>
+        <w:pStyle w:val="H2"/>
+        <w:rPr/>
+      </w:pPr>
+      <w:r>
+        <w:rPr/>
+        <w:t xml:space="preserve">2 Які характеристики вебсайту необхідно враховувати перед початком SEO-аудиту? </w:t>
+      </w:r>
+    </w:p>
+    <w:p>
+      <w:pPr>
+        <w:pStyle w:val="P1"/>
+        <w:rPr/>
+      </w:pPr>
+      <w:r>
+        <w:rPr/>
+      </w:r>
+    </w:p>
+    <w:p>
+      <w:pPr>
+        <w:pStyle w:val="P1"/>
+        <w:rPr/>
+      </w:pPr>
+      <w:r>
+        <w:rPr/>
+        <w:t>Тематика сайту, цільова авдиторія, розмір, структура, технології, регіон і конкуренти.</w:t>
+      </w:r>
+    </w:p>
+    <w:p>
+      <w:pPr>
+        <w:pStyle w:val="P1"/>
+        <w:rPr/>
+      </w:pPr>
+      <w:r>
+        <w:rPr/>
+      </w:r>
+    </w:p>
+    <w:p>
+      <w:pPr>
+        <w:pStyle w:val="H2"/>
+        <w:rPr/>
+      </w:pPr>
+      <w:r>
+        <w:rPr/>
+        <w:t xml:space="preserve">3 Як структура вебсайту впливає на зручність навігації та пошукову оптимізацію? </w:t>
+      </w:r>
+    </w:p>
+    <w:p>
+      <w:pPr>
+        <w:pStyle w:val="P1"/>
+        <w:rPr/>
+      </w:pPr>
+      <w:r>
+        <w:rPr/>
+      </w:r>
+    </w:p>
+    <w:p>
+      <w:pPr>
+        <w:pStyle w:val="P1"/>
+        <w:rPr/>
+      </w:pPr>
+      <w:r>
+        <w:rPr/>
+        <w:t>Зрозуміла структура допомагає користувачам при навігації та пошуковим системам при пошуку та індексації сторінок.</w:t>
+      </w:r>
+    </w:p>
+    <w:p>
+      <w:pPr>
+        <w:pStyle w:val="P1"/>
+        <w:rPr/>
+      </w:pPr>
+      <w:r>
+        <w:rPr/>
+      </w:r>
+    </w:p>
+    <w:p>
+      <w:pPr>
+        <w:pStyle w:val="H2"/>
+        <w:rPr/>
+      </w:pPr>
+      <w:r>
+        <w:rPr/>
+        <w:t>4 У чому полягає відмінність між фактичною аудиторією та її гіпотетичними сегментами?</w:t>
+      </w:r>
+    </w:p>
+    <w:p>
+      <w:pPr>
+        <w:pStyle w:val="P1"/>
+        <w:rPr/>
+      </w:pPr>
+      <w:r>
+        <w:rPr/>
+      </w:r>
+    </w:p>
+    <w:p>
+      <w:pPr>
+        <w:pStyle w:val="P1"/>
+        <w:rPr/>
+      </w:pPr>
+      <w:r>
+        <w:rPr/>
+        <w:t>Фактична авдиторія — реальні відвідувачі сайту. Гіпотетичні сегменти — припущення про групи потенційних користувачів, їхні потреби та інтереси.</w:t>
+      </w:r>
+    </w:p>
+    <w:p>
+      <w:pPr>
+        <w:pStyle w:val="P1"/>
+        <w:rPr/>
+      </w:pPr>
+      <w:r>
+        <w:rPr/>
+      </w:r>
+    </w:p>
+    <w:p>
+      <w:pPr>
+        <w:pStyle w:val="H2"/>
+        <w:rPr/>
+      </w:pPr>
+      <w:r>
+        <w:rPr/>
+        <w:t xml:space="preserve">5 Що таке користувацький сценарій? </w:t>
+      </w:r>
+    </w:p>
+    <w:p>
+      <w:pPr>
+        <w:pStyle w:val="P1"/>
+        <w:rPr/>
+      </w:pPr>
+      <w:r>
+        <w:rPr/>
+      </w:r>
+    </w:p>
+    <w:p>
+      <w:pPr>
+        <w:pStyle w:val="P1"/>
+        <w:rPr/>
+      </w:pPr>
+      <w:r>
+        <w:rPr/>
+        <w:t>Послідовність дій користувача для досягнення певної мети на сайті.</w:t>
+      </w:r>
+    </w:p>
+    <w:p>
+      <w:pPr>
+        <w:pStyle w:val="P1"/>
+        <w:rPr/>
+      </w:pPr>
+      <w:r>
+        <w:rPr/>
+      </w:r>
+    </w:p>
+    <w:p>
+      <w:pPr>
+        <w:pStyle w:val="H2"/>
+        <w:rPr/>
+      </w:pPr>
+      <w:r>
+        <w:rPr/>
+        <w:t xml:space="preserve">6 Чим KPI відрізняється від звичайної метрики? </w:t>
+      </w:r>
+    </w:p>
+    <w:p>
+      <w:pPr>
+        <w:pStyle w:val="P1"/>
+        <w:rPr/>
+      </w:pPr>
+      <w:r>
+        <w:rPr/>
+      </w:r>
+    </w:p>
+    <w:p>
+      <w:pPr>
+        <w:pStyle w:val="P1"/>
+        <w:rPr/>
+      </w:pPr>
+      <w:r>
+        <w:rPr/>
+        <w:t xml:space="preserve">Метрика вимірює певний показник, а </w:t>
+      </w:r>
+      <w:r>
+        <w:rPr>
+          <w:lang w:val="en-US"/>
+        </w:rPr>
+        <w:t xml:space="preserve">KPI – </w:t>
+      </w:r>
+      <w:r>
+        <w:rPr>
+          <w:lang w:val="uk-UA"/>
+        </w:rPr>
+        <w:t>ключовий показник, за яким оцінюється досягнення мети.</w:t>
+      </w:r>
+    </w:p>
+    <w:p>
+      <w:pPr>
+        <w:pStyle w:val="P1"/>
+        <w:rPr>
+          <w:lang w:val="uk-UA"/>
+        </w:rPr>
+      </w:pPr>
+      <w:r>
+        <w:rPr>
+          <w:lang w:val="uk-UA"/>
+        </w:rPr>
+      </w:r>
+    </w:p>
+    <w:p>
+      <w:pPr>
+        <w:pStyle w:val="H2"/>
+        <w:rPr/>
+      </w:pPr>
+      <w:r>
+        <w:rPr/>
+        <w:t>7 Які характеристики необхідно визначити для кожного KPI?</w:t>
+      </w:r>
+    </w:p>
+    <w:p>
+      <w:pPr>
+        <w:pStyle w:val="P1"/>
+        <w:rPr/>
+      </w:pPr>
+      <w:r>
+        <w:rPr/>
+      </w:r>
+    </w:p>
+    <w:p>
+      <w:pPr>
+        <w:pStyle w:val="P1"/>
+        <w:rPr/>
+      </w:pPr>
+      <w:r>
+        <w:rPr/>
+        <w:t xml:space="preserve">Для кожного </w:t>
+      </w:r>
+      <w:r>
+        <w:rPr>
+          <w:lang w:val="en-US"/>
+        </w:rPr>
+        <w:t xml:space="preserve">KPI </w:t>
+      </w:r>
+      <w:r>
+        <w:rPr>
+          <w:lang w:val="uk-UA"/>
+        </w:rPr>
+        <w:t>треба визначити назву, мету, спосіб розрахування, одиницю вимірювання, цільове значення та період оцінювання.</w:t>
+      </w:r>
+    </w:p>
+    <w:p>
+      <w:pPr>
+        <w:pStyle w:val="P1"/>
+        <w:rPr/>
+      </w:pPr>
+      <w:r>
+        <w:rPr/>
+      </w:r>
+    </w:p>
+    <w:p>
+      <w:pPr>
+        <w:pStyle w:val="H2"/>
+        <w:rPr/>
+      </w:pPr>
+      <w:r>
+        <w:rPr/>
+        <w:t>8 Як визначається коефіцієнт конверсії?</w:t>
+      </w:r>
+    </w:p>
+    <w:p>
+      <w:pPr>
+        <w:pStyle w:val="P1"/>
+        <w:rPr/>
+      </w:pPr>
+      <w:r>
+        <w:rPr/>
+      </w:r>
+    </w:p>
+    <w:p>
+      <w:pPr>
+        <w:pStyle w:val="P1"/>
+        <w:rPr/>
+      </w:pPr>
+      <w:r>
+        <w:rPr/>
+        <w:t>Коефіцієнт конверсії — відношення кількості користувачів, одиницю вимірювання, цільове значення та період оцінювання.</w:t>
+      </w:r>
+    </w:p>
+    <w:p>
+      <w:pPr>
+        <w:pStyle w:val="P1"/>
+        <w:rPr/>
+      </w:pPr>
+      <w:r>
+        <w:rPr/>
+        <w:t xml:space="preserve">Формула: </w:t>
+      </w:r>
+      <w:r>
+        <w:rPr/>
+        <w:t xml:space="preserve">Кількість Конверсій </w:t>
+      </w:r>
+      <w:r>
+        <w:rPr>
+          <w:lang w:val="en-US"/>
+        </w:rPr>
+        <w:t xml:space="preserve">/ </w:t>
+      </w:r>
+      <w:r>
+        <w:rPr>
+          <w:lang w:val="uk-UA"/>
+        </w:rPr>
+        <w:t>Загальна кількість користувачів * 100%.</w:t>
+      </w:r>
+    </w:p>
+    <w:p>
+      <w:pPr>
+        <w:pStyle w:val="P1"/>
+        <w:rPr/>
+      </w:pPr>
+      <w:r>
+        <w:rPr/>
+      </w:r>
+    </w:p>
+    <w:p>
+      <w:pPr>
+        <w:pStyle w:val="H2"/>
+        <w:rPr/>
+      </w:pPr>
+      <w:r>
+        <w:rPr/>
+        <w:t xml:space="preserve">9 У чому різниця між абсолютними та відносними втратами користувачів? </w:t>
+      </w:r>
+    </w:p>
+    <w:p>
+      <w:pPr>
+        <w:pStyle w:val="P1"/>
+        <w:rPr/>
+      </w:pPr>
+      <w:r>
+        <w:rPr/>
+      </w:r>
+    </w:p>
+    <w:p>
+      <w:pPr>
+        <w:pStyle w:val="P1"/>
+        <w:rPr/>
+      </w:pPr>
+      <w:r>
+        <w:rPr/>
+        <w:t>Абсолютні втрати це кількість користувачів, які залишили сайт або певний етап.</w:t>
+      </w:r>
+    </w:p>
+    <w:p>
+      <w:pPr>
+        <w:pStyle w:val="P1"/>
+        <w:rPr/>
+      </w:pPr>
+      <w:r>
+        <w:rPr/>
+        <w:t>Відносні втрати це їхня частка у відсотках від початкової кількості.</w:t>
+      </w:r>
+    </w:p>
+    <w:p>
+      <w:pPr>
+        <w:pStyle w:val="P1"/>
+        <w:rPr/>
+      </w:pPr>
+      <w:r>
+        <w:rPr/>
+      </w:r>
+    </w:p>
+    <w:p>
+      <w:pPr>
+        <w:pStyle w:val="H2"/>
+        <w:rPr/>
+      </w:pPr>
+      <w:r>
+        <w:rPr/>
+        <w:t>10 Чому високі втрати на певному етапі воронки не дозволяють однозначно встановити причину проблеми?</w:t>
+      </w:r>
+    </w:p>
+    <w:p>
+      <w:pPr>
+        <w:pStyle w:val="P1"/>
+        <w:rPr/>
+      </w:pPr>
+      <w:r>
+        <w:rPr/>
+      </w:r>
+    </w:p>
+    <w:p>
+      <w:pPr>
+        <w:pStyle w:val="P1"/>
+        <w:rPr/>
+      </w:pPr>
+      <w:r>
+        <w:rPr/>
+        <w:t>Високі втрати не визначають причину однозначно, оскільки проблема може бути пов’язана з дизайном, помилками, незрозумілим контентом або невідповідністю очікуванням користувачів.</w:t>
+      </w:r>
+    </w:p>
+    <w:p>
+      <w:pPr>
+        <w:pStyle w:val="P1"/>
+        <w:rPr/>
+      </w:pPr>
+      <w:r>
+        <w:rPr/>
+      </w:r>
+    </w:p>
+    <w:p>
+      <w:pPr>
+        <w:pStyle w:val="H2"/>
+        <w:rPr/>
+      </w:pPr>
+      <w:r>
+        <w:rPr/>
+        <w:t>11 Які дані неможливо отримати без доступу до внутрішніх систем вебаналітики?</w:t>
+      </w:r>
+    </w:p>
+    <w:p>
+      <w:pPr>
+        <w:pStyle w:val="P1"/>
+        <w:rPr/>
+      </w:pPr>
+      <w:r>
+        <w:rPr/>
+      </w:r>
+    </w:p>
+    <w:p>
+      <w:pPr>
+        <w:pStyle w:val="P1"/>
+        <w:rPr/>
+      </w:pPr>
+      <w:r>
+        <w:rPr/>
+        <w:t>Без доступу до внутрішніх систем вебаналітики неможливо точно визначити такі внутрішні показники:</w:t>
+      </w:r>
+    </w:p>
+    <w:p>
+      <w:pPr>
+        <w:pStyle w:val="P1"/>
+        <w:widowControl/>
+        <w:numPr>
+          <w:ilvl w:val="0"/>
+          <w:numId w:val="2"/>
+        </w:numPr>
+        <w:suppressAutoHyphens w:val="true"/>
+        <w:bidi w:val="0"/>
+        <w:spacing w:lineRule="auto" w:line="360" w:before="0" w:after="0"/>
+        <w:ind w:firstLine="850" w:left="0" w:right="0"/>
+        <w:jc w:val="both"/>
+        <w:rPr/>
+      </w:pPr>
+      <w:r>
+        <w:rPr/>
+        <w:t>поведінку конкретних сегментів;</w:t>
+      </w:r>
+    </w:p>
+    <w:p>
+      <w:pPr>
+        <w:pStyle w:val="P1"/>
+        <w:widowControl/>
+        <w:numPr>
+          <w:ilvl w:val="0"/>
+          <w:numId w:val="2"/>
+        </w:numPr>
+        <w:suppressAutoHyphens w:val="true"/>
+        <w:bidi w:val="0"/>
+        <w:spacing w:lineRule="auto" w:line="360" w:before="0" w:after="0"/>
+        <w:ind w:firstLine="850" w:left="0" w:right="0"/>
+        <w:jc w:val="both"/>
+        <w:rPr>
+          <w:lang w:val="uk-UA"/>
+        </w:rPr>
+      </w:pPr>
+      <w:r>
+        <w:rPr>
+          <w:lang w:val="uk-UA"/>
+        </w:rPr>
+        <w:t>конверсії;</w:t>
+      </w:r>
+    </w:p>
+    <w:p>
+      <w:pPr>
+        <w:pStyle w:val="P1"/>
+        <w:widowControl/>
+        <w:numPr>
+          <w:ilvl w:val="0"/>
+          <w:numId w:val="2"/>
+        </w:numPr>
+        <w:suppressAutoHyphens w:val="true"/>
+        <w:bidi w:val="0"/>
+        <w:spacing w:lineRule="auto" w:line="360" w:before="0" w:after="0"/>
+        <w:ind w:firstLine="850" w:left="0" w:right="0"/>
+        <w:jc w:val="both"/>
+        <w:rPr>
+          <w:lang w:val="uk-UA"/>
+        </w:rPr>
+      </w:pPr>
+      <w:r>
+        <w:rPr>
+          <w:lang w:val="uk-UA"/>
+        </w:rPr>
+        <w:t>джерела трафіку;</w:t>
+      </w:r>
+    </w:p>
+    <w:p>
+      <w:pPr>
+        <w:pStyle w:val="P1"/>
+        <w:widowControl/>
+        <w:numPr>
+          <w:ilvl w:val="0"/>
+          <w:numId w:val="2"/>
+        </w:numPr>
+        <w:suppressAutoHyphens w:val="true"/>
+        <w:bidi w:val="0"/>
+        <w:spacing w:lineRule="auto" w:line="360" w:before="0" w:after="0"/>
+        <w:ind w:firstLine="850" w:left="0" w:right="0"/>
+        <w:jc w:val="both"/>
+        <w:rPr>
+          <w:lang w:val="uk-UA"/>
+        </w:rPr>
+      </w:pPr>
+      <w:r>
+        <w:rPr>
+          <w:lang w:val="uk-UA"/>
+        </w:rPr>
+        <w:t>шляхи користувачів.</w:t>
+      </w:r>
+    </w:p>
+    <w:p>
+      <w:pPr>
+        <w:pStyle w:val="P1"/>
+        <w:widowControl/>
+        <w:suppressAutoHyphens w:val="true"/>
+        <w:bidi w:val="0"/>
+        <w:spacing w:lineRule="auto" w:line="360" w:before="0" w:after="0"/>
+        <w:ind w:firstLine="850" w:left="0" w:right="0"/>
+        <w:jc w:val="both"/>
+        <w:rPr>
+          <w:lang w:val="uk-UA"/>
+        </w:rPr>
+      </w:pPr>
+      <w:r>
+        <w:rPr>
+          <w:lang w:val="uk-UA"/>
+        </w:rPr>
+      </w:r>
+    </w:p>
+    <w:p>
+      <w:pPr>
+        <w:pStyle w:val="H2"/>
+        <w:rPr/>
+      </w:pPr>
+      <w:r>
+        <w:rPr/>
+        <w:t>12 Як результати лабораторної роботи No 1 використовуватимуться під час SEO-оптимізації?</w:t>
+      </w:r>
+    </w:p>
+    <w:p>
+      <w:pPr>
+        <w:pStyle w:val="P1"/>
+        <w:rPr/>
+      </w:pPr>
+      <w:r>
+        <w:rPr/>
+      </w:r>
+    </w:p>
+    <w:p>
+      <w:pPr>
+        <w:pStyle w:val="P1"/>
+        <w:rPr/>
+      </w:pPr>
+      <w:r>
+        <w:rPr/>
+        <w:t xml:space="preserve">Результати лабораторної роботи №1 допоможуть виявити недоліки сайту, визначити пріоритетні сторінки та сформувати план </w:t>
+      </w:r>
+      <w:r>
+        <w:rPr>
+          <w:lang w:val="en-US"/>
+        </w:rPr>
+        <w:t>SEO-</w:t>
+      </w:r>
+      <w:r>
+        <w:rPr>
+          <w:lang w:val="uk-UA"/>
+        </w:rPr>
+        <w:t>оптимізації для покращення видимості в пошукових системах.</w:t>
       </w:r>
     </w:p>
     <w:sectPr>
@@ -755,6 +1390,143 @@
   <w:abstractNum w:abstractNumId="2">
     <w:lvl w:ilvl="0">
       <w:start w:val="1"/>
+      <w:numFmt w:val="bullet"/>
+      <w:lvlText w:val=""/>
+      <w:lvlJc w:val="left"/>
+      <w:pPr>
+        <w:tabs>
+          <w:tab w:val="num" w:pos="720"/>
+        </w:tabs>
+        <w:ind w:left="720" w:hanging="360"/>
+      </w:pPr>
+      <w:rPr>
+        <w:rFonts w:ascii="Symbol" w:hAnsi="Symbol" w:cs="Symbol" w:hint="default"/>
+      </w:rPr>
+    </w:lvl>
+    <w:lvl w:ilvl="1">
+      <w:start w:val="1"/>
+      <w:numFmt w:val="bullet"/>
+      <w:lvlText w:val="◦"/>
+      <w:lvlJc w:val="left"/>
+      <w:pPr>
+        <w:tabs>
+          <w:tab w:val="num" w:pos="1080"/>
+        </w:tabs>
+        <w:ind w:left="1080" w:hanging="360"/>
+      </w:pPr>
+      <w:rPr>
+        <w:rFonts w:ascii="OpenSymbol" w:hAnsi="OpenSymbol" w:cs="OpenSymbol" w:hint="default"/>
+      </w:rPr>
+    </w:lvl>
+    <w:lvl w:ilvl="2">
+      <w:start w:val="1"/>
+      <w:numFmt w:val="bullet"/>
+      <w:lvlText w:val="▪"/>
+      <w:lvlJc w:val="left"/>
+      <w:pPr>
+        <w:tabs>
+          <w:tab w:val="num" w:pos="1440"/>
+        </w:tabs>
+        <w:ind w:left="1440" w:hanging="360"/>
+      </w:pPr>
+      <w:rPr>
+        <w:rFonts w:ascii="OpenSymbol" w:hAnsi="OpenSymbol" w:cs="OpenSymbol" w:hint="default"/>
+      </w:rPr>
+    </w:lvl>
+    <w:lvl w:ilvl="3">
+      <w:start w:val="1"/>
+      <w:numFmt w:val="bullet"/>
+      <w:lvlText w:val=""/>
+      <w:lvlJc w:val="left"/>
+      <w:pPr>
+        <w:tabs>
+          <w:tab w:val="num" w:pos="1800"/>
+        </w:tabs>
+        <w:ind w:left="1800" w:hanging="360"/>
+      </w:pPr>
+      <w:rPr>
+        <w:rFonts w:ascii="Symbol" w:hAnsi="Symbol" w:cs="Symbol" w:hint="default"/>
+      </w:rPr>
+    </w:lvl>
+    <w:lvl w:ilvl="4">
+      <w:start w:val="1"/>
+      <w:numFmt w:val="bullet"/>
+      <w:lvlText w:val="◦"/>
+      <w:lvlJc w:val="left"/>
+      <w:pPr>
+        <w:tabs>
+          <w:tab w:val="num" w:pos="2160"/>
+        </w:tabs>
+        <w:ind w:left="2160" w:hanging="360"/>
+      </w:pPr>
+      <w:rPr>
+        <w:rFonts w:ascii="OpenSymbol" w:hAnsi="OpenSymbol" w:cs="OpenSymbol" w:hint="default"/>
+      </w:rPr>
+    </w:lvl>
+    <w:lvl w:ilvl="5">
+      <w:start w:val="1"/>
+      <w:numFmt w:val="bullet"/>
+      <w:lvlText w:val="▪"/>
+      <w:lvlJc w:val="left"/>
+      <w:pPr>
+        <w:tabs>
+          <w:tab w:val="num" w:pos="2520"/>
+        </w:tabs>
+        <w:ind w:left="2520" w:hanging="360"/>
+      </w:pPr>
+      <w:rPr>
+        <w:rFonts w:ascii="OpenSymbol" w:hAnsi="OpenSymbol" w:cs="OpenSymbol" w:hint="default"/>
+      </w:rPr>
+    </w:lvl>
+    <w:lvl w:ilvl="6">
+      <w:start w:val="1"/>
+      <w:numFmt w:val="bullet"/>
+      <w:lvlText w:val=""/>
+      <w:lvlJc w:val="left"/>
+      <w:pPr>
+        <w:tabs>
+          <w:tab w:val="num" w:pos="2880"/>
+        </w:tabs>
+        <w:ind w:left="2880" w:hanging="360"/>
+      </w:pPr>
+      <w:rPr>
+        <w:rFonts w:ascii="Symbol" w:hAnsi="Symbol" w:cs="Symbol" w:hint="default"/>
+      </w:rPr>
+    </w:lvl>
+    <w:lvl w:ilvl="7">
+      <w:start w:val="1"/>
+      <w:numFmt w:val="bullet"/>
+      <w:lvlText w:val="◦"/>
+      <w:lvlJc w:val="left"/>
+      <w:pPr>
+        <w:tabs>
+          <w:tab w:val="num" w:pos="3240"/>
+        </w:tabs>
+        <w:ind w:left="3240" w:hanging="360"/>
+      </w:pPr>
+      <w:rPr>
+        <w:rFonts w:ascii="OpenSymbol" w:hAnsi="OpenSymbol" w:cs="OpenSymbol" w:hint="default"/>
+      </w:rPr>
+    </w:lvl>
+    <w:lvl w:ilvl="8">
+      <w:start w:val="1"/>
+      <w:numFmt w:val="bullet"/>
+      <w:lvlText w:val="▪"/>
+      <w:lvlJc w:val="left"/>
+      <w:pPr>
+        <w:tabs>
+          <w:tab w:val="num" w:pos="3600"/>
+        </w:tabs>
+        <w:ind w:left="3600" w:hanging="360"/>
+      </w:pPr>
+      <w:rPr>
+        <w:rFonts w:ascii="OpenSymbol" w:hAnsi="OpenSymbol" w:cs="OpenSymbol" w:hint="default"/>
+      </w:rPr>
+    </w:lvl>
+  </w:abstractNum>
+  <w:abstractNum w:abstractNumId="3">
+    <w:lvl w:ilvl="0">
+      <w:start w:val="1"/>
       <w:numFmt w:val="none"/>
       <w:suff w:val="nothing"/>
       <w:lvlText w:val=""/>
@@ -876,6 +1648,9 @@
   </w:num>
   <w:num w:numId="2">
     <w:abstractNumId w:val="2"/>
+  </w:num>
+  <w:num w:numId="3">
+    <w:abstractNumId w:val="3"/>
   </w:num>
 </w:numbering>
 </file>
@@ -1665,19 +2440,26 @@
       <w:lang w:val="en-US" w:eastAsia="uk-UA"/>
     </w:rPr>
   </w:style>
+  <w:style w:type="character" w:styleId="user">
+    <w:name w:val="Символ нумерації (user)"/>
+    <w:qFormat/>
+    <w:rPr/>
+  </w:style>
+  <w:style w:type="character" w:styleId="user1">
+    <w:name w:val="Маркери (user)"/>
+    <w:qFormat/>
+    <w:rPr>
+      <w:rFonts w:ascii="OpenSymbol" w:hAnsi="OpenSymbol" w:eastAsia="OpenSymbol" w:cs="OpenSymbol"/>
+    </w:rPr>
+  </w:style>
   <w:style w:type="character" w:styleId="Style12">
-    <w:name w:val="Символ нумерації"/>
-    <w:qFormat/>
-    <w:rPr/>
-  </w:style>
-  <w:style w:type="character" w:styleId="Style13">
     <w:name w:val="Маркери"/>
     <w:qFormat/>
     <w:rPr>
       <w:rFonts w:ascii="OpenSymbol" w:hAnsi="OpenSymbol" w:eastAsia="OpenSymbol" w:cs="OpenSymbol"/>
     </w:rPr>
   </w:style>
-  <w:style w:type="paragraph" w:styleId="Style14">
+  <w:style w:type="paragraph" w:styleId="Style13">
     <w:name w:val="Заголовок"/>
     <w:basedOn w:val="Normal"/>
     <w:next w:val="BodyText"/>
@@ -1687,7 +2469,7 @@
       <w:spacing w:before="240" w:after="120"/>
     </w:pPr>
     <w:rPr>
-      <w:rFonts w:ascii="Liberation Sans" w:hAnsi="Liberation Sans" w:eastAsia="Microsoft YaHei" w:cs="Lucida Sans"/>
+      <w:rFonts w:ascii="Liberation Sans" w:hAnsi="Liberation Sans" w:eastAsia="Microsoft YaHei" w:cs="Arial Unicode MS"/>
       <w:sz w:val="28"/>
       <w:szCs w:val="28"/>
     </w:rPr>
@@ -1724,7 +2506,7 @@
       <w:szCs w:val="24"/>
     </w:rPr>
   </w:style>
-  <w:style w:type="paragraph" w:styleId="Style15">
+  <w:style w:type="paragraph" w:styleId="Style14">
     <w:name w:val="Покажчик"/>
     <w:basedOn w:val="Normal"/>
     <w:qFormat/>
@@ -1732,10 +2514,10 @@
       <w:suppressLineNumbers/>
     </w:pPr>
     <w:rPr>
-      <w:rFonts w:cs="Lucida Sans"/>
-    </w:rPr>
-  </w:style>
-  <w:style w:type="paragraph" w:styleId="user">
+      <w:rFonts w:cs="Arial Unicode MS"/>
+    </w:rPr>
+  </w:style>
+  <w:style w:type="paragraph" w:styleId="user2">
     <w:name w:val="Заголовок (user)"/>
     <w:basedOn w:val="Normal"/>
     <w:next w:val="BodyText"/>
@@ -1745,12 +2527,12 @@
       <w:spacing w:before="240" w:after="120"/>
     </w:pPr>
     <w:rPr>
-      <w:rFonts w:ascii="Liberation Sans" w:hAnsi="Liberation Sans" w:eastAsia="Microsoft YaHei" w:cs="Arial Unicode MS"/>
+      <w:rFonts w:ascii="Liberation Sans" w:hAnsi="Liberation Sans" w:eastAsia="Microsoft YaHei" w:cs="Lucida Sans"/>
       <w:sz w:val="28"/>
       <w:szCs w:val="28"/>
     </w:rPr>
   </w:style>
-  <w:style w:type="paragraph" w:styleId="user1">
+  <w:style w:type="paragraph" w:styleId="user3">
     <w:name w:val="Покажчик (user)"/>
     <w:basedOn w:val="Normal"/>
     <w:qFormat/>
@@ -1758,12 +2540,12 @@
       <w:suppressLineNumbers/>
     </w:pPr>
     <w:rPr>
-      <w:rFonts w:cs="Arial Unicode MS"/>
+      <w:rFonts w:cs="Lucida Sans"/>
     </w:rPr>
   </w:style>
   <w:style w:type="paragraph" w:styleId="IndexHeading">
     <w:name w:val="index heading"/>
-    <w:basedOn w:val="user"/>
+    <w:basedOn w:val="Style13"/>
     <w:pPr/>
     <w:rPr/>
   </w:style>
@@ -2039,8 +2821,8 @@
     </w:pPr>
     <w:rPr/>
   </w:style>
-  <w:style w:type="numbering" w:styleId="user2" w:default="1">
-    <w:name w:val="Без маркерів (user)"/>
+  <w:style w:type="numbering" w:styleId="Style15" w:default="1">
+    <w:name w:val="Без маркерів"/>
     <w:uiPriority w:val="99"/>
     <w:semiHidden/>
     <w:unhideWhenUsed/>

</xml_diff>